<commit_message>
fix: preencher tag do manometro no RTP
</commit_message>
<xml_diff>
--- a/Modelos/definitivos/Modelo - RTP.docx
+++ b/Modelos/definitivos/Modelo - RTP.docx
@@ -114,7 +114,25 @@
                 <w:sz w:val="18"/>
                 <w:szCs w:val="18"/>
               </w:rPr>
-              <w:t>{{equipament}}</w:t>
+              <w:t>{{</w:t>
+            </w:r>
+            <w:proofErr w:type="spellStart"/>
+            <w:r>
+              <w:rPr>
+                <w:color w:val="11437E"/>
+                <w:sz w:val="18"/>
+                <w:szCs w:val="18"/>
+              </w:rPr>
+              <w:t>equipament</w:t>
+            </w:r>
+            <w:proofErr w:type="spellEnd"/>
+            <w:r>
+              <w:rPr>
+                <w:color w:val="11437E"/>
+                <w:sz w:val="18"/>
+                <w:szCs w:val="18"/>
+              </w:rPr>
+              <w:t>}}</w:t>
             </w:r>
           </w:p>
         </w:tc>
@@ -173,6 +191,7 @@
               </w:rPr>
               <w:t>{{</w:t>
             </w:r>
+            <w:proofErr w:type="spellStart"/>
             <w:r>
               <w:rPr>
                 <w:color w:val="11437E"/>
@@ -181,6 +200,7 @@
               </w:rPr>
               <w:t>fluid</w:t>
             </w:r>
+            <w:proofErr w:type="spellEnd"/>
             <w:r>
               <w:rPr>
                 <w:color w:val="11437E"/>
@@ -237,6 +257,7 @@
               </w:rPr>
               <w:t>{{</w:t>
             </w:r>
+            <w:proofErr w:type="spellStart"/>
             <w:r>
               <w:rPr>
                 <w:color w:val="11437E"/>
@@ -245,6 +266,7 @@
               </w:rPr>
               <w:t>projectpressure</w:t>
             </w:r>
+            <w:proofErr w:type="spellEnd"/>
             <w:r>
               <w:rPr>
                 <w:color w:val="11437E"/>
@@ -311,6 +333,7 @@
               </w:rPr>
               <w:t>{{</w:t>
             </w:r>
+            <w:proofErr w:type="spellStart"/>
             <w:r>
               <w:rPr>
                 <w:color w:val="11437E"/>
@@ -319,6 +342,7 @@
               </w:rPr>
               <w:t>testpressure</w:t>
             </w:r>
+            <w:proofErr w:type="spellEnd"/>
             <w:r>
               <w:rPr>
                 <w:color w:val="11437E"/>
@@ -419,6 +443,7 @@
               </w:rPr>
               <w:t>{{</w:t>
             </w:r>
+            <w:proofErr w:type="spellStart"/>
             <w:r>
               <w:rPr>
                 <w:color w:val="11437E"/>
@@ -427,6 +452,7 @@
               </w:rPr>
               <w:t>testunit</w:t>
             </w:r>
+            <w:proofErr w:type="spellEnd"/>
             <w:r>
               <w:rPr>
                 <w:color w:val="11437E"/>
@@ -483,13 +509,23 @@
               </w:rPr>
               <w:t>{{</w:t>
             </w:r>
-            <w:r>
-              <w:rPr>
-                <w:color w:val="11437E"/>
-                <w:sz w:val="18"/>
-                <w:szCs w:val="18"/>
-              </w:rPr>
-              <w:t>starttime}</w:t>
+            <w:proofErr w:type="spellStart"/>
+            <w:r>
+              <w:rPr>
+                <w:color w:val="11437E"/>
+                <w:sz w:val="18"/>
+                <w:szCs w:val="18"/>
+              </w:rPr>
+              <w:t>starttime</w:t>
+            </w:r>
+            <w:proofErr w:type="spellEnd"/>
+            <w:r>
+              <w:rPr>
+                <w:color w:val="11437E"/>
+                <w:sz w:val="18"/>
+                <w:szCs w:val="18"/>
+              </w:rPr>
+              <w:t>}</w:t>
             </w:r>
             <w:r>
               <w:rPr>
@@ -559,6 +595,7 @@
               </w:rPr>
               <w:t>{{</w:t>
             </w:r>
+            <w:proofErr w:type="spellStart"/>
             <w:r>
               <w:rPr>
                 <w:color w:val="11437E"/>
@@ -567,6 +604,7 @@
               </w:rPr>
               <w:t>endtime</w:t>
             </w:r>
+            <w:proofErr w:type="spellEnd"/>
             <w:r>
               <w:rPr>
                 <w:color w:val="11437E"/>
@@ -607,22 +645,51 @@
                 <w:szCs w:val="18"/>
               </w:rPr>
             </w:pPr>
-            <w:r>
-              <w:rPr>
-                <w:b/>
-                <w:bCs/>
-                <w:sz w:val="18"/>
-                <w:szCs w:val="18"/>
-              </w:rPr>
-              <w:t xml:space="preserve">Tags: </w:t>
-            </w:r>
-            <w:r>
-              <w:rPr>
-                <w:color w:val="11437E"/>
-                <w:sz w:val="18"/>
-                <w:szCs w:val="18"/>
-              </w:rPr>
-              <w:t>{{tags}}</w:t>
+            <w:proofErr w:type="spellStart"/>
+            <w:r>
+              <w:rPr>
+                <w:b/>
+                <w:bCs/>
+                <w:sz w:val="18"/>
+                <w:szCs w:val="18"/>
+              </w:rPr>
+              <w:t>Tags</w:t>
+            </w:r>
+            <w:proofErr w:type="spellEnd"/>
+            <w:r>
+              <w:rPr>
+                <w:b/>
+                <w:bCs/>
+                <w:sz w:val="18"/>
+                <w:szCs w:val="18"/>
+              </w:rPr>
+              <w:t xml:space="preserve">: </w:t>
+            </w:r>
+            <w:r>
+              <w:rPr>
+                <w:color w:val="11437E"/>
+                <w:sz w:val="18"/>
+                <w:szCs w:val="18"/>
+              </w:rPr>
+              <w:t>{{</w:t>
+            </w:r>
+            <w:proofErr w:type="spellStart"/>
+            <w:r>
+              <w:rPr>
+                <w:color w:val="11437E"/>
+                <w:sz w:val="18"/>
+                <w:szCs w:val="18"/>
+              </w:rPr>
+              <w:t>tags</w:t>
+            </w:r>
+            <w:proofErr w:type="spellEnd"/>
+            <w:r>
+              <w:rPr>
+                <w:color w:val="11437E"/>
+                <w:sz w:val="18"/>
+                <w:szCs w:val="18"/>
+              </w:rPr>
+              <w:t>}}</w:t>
             </w:r>
           </w:p>
         </w:tc>
@@ -673,6 +740,7 @@
               </w:rPr>
               <w:t>{{</w:t>
             </w:r>
+            <w:proofErr w:type="spellStart"/>
             <w:r>
               <w:rPr>
                 <w:color w:val="11437E"/>
@@ -681,6 +749,7 @@
               </w:rPr>
               <w:t>rtp</w:t>
             </w:r>
+            <w:proofErr w:type="spellEnd"/>
             <w:r>
               <w:rPr>
                 <w:color w:val="11437E"/>
@@ -848,7 +917,25 @@
                 <w:sz w:val="18"/>
                 <w:szCs w:val="18"/>
               </w:rPr>
-              <w:t>{{diameter}}</w:t>
+              <w:t>{{</w:t>
+            </w:r>
+            <w:proofErr w:type="spellStart"/>
+            <w:r>
+              <w:rPr>
+                <w:color w:val="11437E"/>
+                <w:sz w:val="18"/>
+                <w:szCs w:val="18"/>
+              </w:rPr>
+              <w:t>diameter</w:t>
+            </w:r>
+            <w:proofErr w:type="spellEnd"/>
+            <w:r>
+              <w:rPr>
+                <w:color w:val="11437E"/>
+                <w:sz w:val="18"/>
+                <w:szCs w:val="18"/>
+              </w:rPr>
+              <w:t>}}</w:t>
             </w:r>
           </w:p>
         </w:tc>
@@ -868,7 +955,25 @@
                 <w:sz w:val="18"/>
                 <w:szCs w:val="18"/>
               </w:rPr>
-              <w:t>{{length}}</w:t>
+              <w:t>{{</w:t>
+            </w:r>
+            <w:proofErr w:type="spellStart"/>
+            <w:r>
+              <w:rPr>
+                <w:color w:val="11437E"/>
+                <w:sz w:val="18"/>
+                <w:szCs w:val="18"/>
+              </w:rPr>
+              <w:t>length</w:t>
+            </w:r>
+            <w:proofErr w:type="spellEnd"/>
+            <w:r>
+              <w:rPr>
+                <w:color w:val="11437E"/>
+                <w:sz w:val="18"/>
+                <w:szCs w:val="18"/>
+              </w:rPr>
+              <w:t>}}</w:t>
             </w:r>
           </w:p>
         </w:tc>
@@ -1029,7 +1134,25 @@
                 <w:sz w:val="18"/>
                 <w:szCs w:val="18"/>
               </w:rPr>
-              <w:t>{{collaboratorname}}</w:t>
+              <w:t>{{</w:t>
+            </w:r>
+            <w:proofErr w:type="spellStart"/>
+            <w:r>
+              <w:rPr>
+                <w:color w:val="11437E"/>
+                <w:sz w:val="18"/>
+                <w:szCs w:val="18"/>
+              </w:rPr>
+              <w:t>collaboratorname</w:t>
+            </w:r>
+            <w:proofErr w:type="spellEnd"/>
+            <w:r>
+              <w:rPr>
+                <w:color w:val="11437E"/>
+                <w:sz w:val="18"/>
+                <w:szCs w:val="18"/>
+              </w:rPr>
+              <w:t>}}</w:t>
             </w:r>
           </w:p>
         </w:tc>
@@ -1055,7 +1178,25 @@
                 <w:sz w:val="18"/>
                 <w:szCs w:val="18"/>
               </w:rPr>
-              <w:t>{{collaboratorposition}}</w:t>
+              <w:t>{{</w:t>
+            </w:r>
+            <w:proofErr w:type="spellStart"/>
+            <w:r>
+              <w:rPr>
+                <w:color w:val="11437E"/>
+                <w:sz w:val="18"/>
+                <w:szCs w:val="18"/>
+              </w:rPr>
+              <w:t>collaboratorposition</w:t>
+            </w:r>
+            <w:proofErr w:type="spellEnd"/>
+            <w:r>
+              <w:rPr>
+                <w:color w:val="11437E"/>
+                <w:sz w:val="18"/>
+                <w:szCs w:val="18"/>
+              </w:rPr>
+              <w:t>}}</w:t>
             </w:r>
           </w:p>
         </w:tc>
@@ -1082,8 +1223,9 @@
         <w:tblLook w:val="0600" w:firstRow="0" w:lastRow="0" w:firstColumn="0" w:lastColumn="0" w:noHBand="1" w:noVBand="1"/>
       </w:tblPr>
       <w:tblGrid>
-        <w:gridCol w:w="2547"/>
-        <w:gridCol w:w="2977"/>
+        <w:gridCol w:w="1273"/>
+        <w:gridCol w:w="1841"/>
+        <w:gridCol w:w="2410"/>
         <w:gridCol w:w="2409"/>
         <w:gridCol w:w="2417"/>
       </w:tblGrid>
@@ -1096,7 +1238,7 @@
         <w:tc>
           <w:tcPr>
             <w:tcW w:w="10350" w:type="dxa"/>
-            <w:gridSpan w:val="4"/>
+            <w:gridSpan w:val="5"/>
             <w:shd w:val="clear" w:color="auto" w:fill="30503E"/>
             <w:vAlign w:val="center"/>
           </w:tcPr>
@@ -1122,6 +1264,157 @@
                 <w:szCs w:val="18"/>
               </w:rPr>
               <w:t>MANÔMETROS</w:t>
+            </w:r>
+          </w:p>
+        </w:tc>
+      </w:tr>
+      <w:tr>
+        <w:trPr>
+          <w:trHeight w:val="251"/>
+          <w:jc w:val="center"/>
+        </w:trPr>
+        <w:tc>
+          <w:tcPr>
+            <w:tcW w:w="1273" w:type="dxa"/>
+            <w:shd w:val="clear" w:color="auto" w:fill="E8E8E8"/>
+            <w:vAlign w:val="center"/>
+          </w:tcPr>
+          <w:p>
+            <w:pPr>
+              <w:widowControl w:val="0"/>
+              <w:spacing w:line="216" w:lineRule="auto"/>
+              <w:jc w:val="center"/>
+              <w:rPr>
+                <w:b/>
+                <w:bCs/>
+                <w:sz w:val="18"/>
+                <w:szCs w:val="18"/>
+              </w:rPr>
+            </w:pPr>
+            <w:r>
+              <w:rPr>
+                <w:b/>
+                <w:bCs/>
+                <w:sz w:val="18"/>
+                <w:szCs w:val="18"/>
+              </w:rPr>
+              <w:t>TAG</w:t>
+            </w:r>
+          </w:p>
+        </w:tc>
+        <w:tc>
+          <w:tcPr>
+            <w:tcW w:w="1841" w:type="dxa"/>
+            <w:shd w:val="clear" w:color="auto" w:fill="E8E8E8"/>
+            <w:vAlign w:val="center"/>
+          </w:tcPr>
+          <w:p>
+            <w:pPr>
+              <w:widowControl w:val="0"/>
+              <w:spacing w:line="216" w:lineRule="auto"/>
+              <w:jc w:val="center"/>
+              <w:rPr>
+                <w:b/>
+                <w:bCs/>
+                <w:sz w:val="18"/>
+                <w:szCs w:val="18"/>
+              </w:rPr>
+            </w:pPr>
+            <w:r>
+              <w:rPr>
+                <w:b/>
+                <w:bCs/>
+                <w:sz w:val="18"/>
+                <w:szCs w:val="18"/>
+              </w:rPr>
+              <w:t>Escala do manômetro</w:t>
+            </w:r>
+          </w:p>
+        </w:tc>
+        <w:tc>
+          <w:tcPr>
+            <w:tcW w:w="2410" w:type="dxa"/>
+            <w:shd w:val="clear" w:color="auto" w:fill="E8E8E8"/>
+            <w:vAlign w:val="center"/>
+          </w:tcPr>
+          <w:p>
+            <w:pPr>
+              <w:widowControl w:val="0"/>
+              <w:spacing w:line="216" w:lineRule="auto"/>
+              <w:jc w:val="center"/>
+              <w:rPr>
+                <w:b/>
+                <w:bCs/>
+                <w:sz w:val="18"/>
+                <w:szCs w:val="18"/>
+              </w:rPr>
+            </w:pPr>
+            <w:r>
+              <w:rPr>
+                <w:b/>
+                <w:bCs/>
+                <w:sz w:val="18"/>
+                <w:szCs w:val="18"/>
+              </w:rPr>
+              <w:t>N° do certificado de calibração</w:t>
+            </w:r>
+          </w:p>
+        </w:tc>
+        <w:tc>
+          <w:tcPr>
+            <w:tcW w:w="2409" w:type="dxa"/>
+            <w:shd w:val="clear" w:color="auto" w:fill="E8E8E8"/>
+            <w:vAlign w:val="center"/>
+          </w:tcPr>
+          <w:p>
+            <w:pPr>
+              <w:widowControl w:val="0"/>
+              <w:spacing w:line="216" w:lineRule="auto"/>
+              <w:jc w:val="center"/>
+              <w:rPr>
+                <w:b/>
+                <w:bCs/>
+                <w:sz w:val="18"/>
+                <w:szCs w:val="18"/>
+              </w:rPr>
+            </w:pPr>
+            <w:r>
+              <w:rPr>
+                <w:b/>
+                <w:bCs/>
+                <w:sz w:val="18"/>
+                <w:szCs w:val="18"/>
+              </w:rPr>
+              <w:t>Data de calibração</w:t>
+            </w:r>
+          </w:p>
+        </w:tc>
+        <w:tc>
+          <w:tcPr>
+            <w:tcW w:w="2417" w:type="dxa"/>
+            <w:shd w:val="clear" w:color="auto" w:fill="E8E8E8"/>
+            <w:vAlign w:val="center"/>
+          </w:tcPr>
+          <w:p>
+            <w:pPr>
+              <w:widowControl w:val="0"/>
+              <w:spacing w:line="216" w:lineRule="auto"/>
+              <w:jc w:val="center"/>
+              <w:rPr>
+                <w:b/>
+                <w:bCs/>
+                <w:sz w:val="18"/>
+                <w:szCs w:val="18"/>
+              </w:rPr>
+            </w:pPr>
+            <w:r>
+              <w:rPr>
+                <w:b/>
+                <w:bCs/>
+                <w:sz w:val="18"/>
+                <w:szCs w:val="18"/>
+              </w:rPr>
+              <w:t>Validade da calibração</w:t>
             </w:r>
           </w:p>
         </w:tc>
@@ -1133,8 +1426,7 @@
         </w:trPr>
         <w:tc>
           <w:tcPr>
-            <w:tcW w:w="2547" w:type="dxa"/>
-            <w:shd w:val="clear" w:color="auto" w:fill="E8E8E8"/>
+            <w:tcW w:w="1273" w:type="dxa"/>
             <w:vAlign w:val="center"/>
           </w:tcPr>
           <w:p>
@@ -1143,27 +1435,42 @@
               <w:spacing w:line="216" w:lineRule="auto"/>
               <w:jc w:val="center"/>
               <w:rPr>
-                <w:b/>
-                <w:bCs/>
-                <w:sz w:val="18"/>
-                <w:szCs w:val="18"/>
-              </w:rPr>
-            </w:pPr>
-            <w:r>
-              <w:rPr>
-                <w:b/>
-                <w:bCs/>
-                <w:sz w:val="18"/>
-                <w:szCs w:val="18"/>
-              </w:rPr>
-              <w:t>Escala do manômetro</w:t>
+                <w:color w:val="11437E"/>
+                <w:sz w:val="18"/>
+                <w:szCs w:val="18"/>
+              </w:rPr>
+            </w:pPr>
+            <w:r>
+              <w:rPr>
+                <w:color w:val="11437E"/>
+                <w:sz w:val="18"/>
+                <w:szCs w:val="18"/>
+              </w:rPr>
+              <w:t>{{</w:t>
+            </w:r>
+            <w:proofErr w:type="spellStart"/>
+            <w:r>
+              <w:rPr>
+                <w:color w:val="11437E"/>
+                <w:sz w:val="18"/>
+                <w:szCs w:val="18"/>
+              </w:rPr>
+              <w:t>manometer_tag</w:t>
+            </w:r>
+            <w:proofErr w:type="spellEnd"/>
+            <w:r>
+              <w:rPr>
+                <w:color w:val="11437E"/>
+                <w:sz w:val="18"/>
+                <w:szCs w:val="18"/>
+              </w:rPr>
+              <w:t>}}</w:t>
             </w:r>
           </w:p>
         </w:tc>
         <w:tc>
           <w:tcPr>
-            <w:tcW w:w="2977" w:type="dxa"/>
-            <w:shd w:val="clear" w:color="auto" w:fill="E8E8E8"/>
+            <w:tcW w:w="1841" w:type="dxa"/>
             <w:vAlign w:val="center"/>
           </w:tcPr>
           <w:p>
@@ -1172,90 +1479,42 @@
               <w:spacing w:line="216" w:lineRule="auto"/>
               <w:jc w:val="center"/>
               <w:rPr>
-                <w:b/>
-                <w:bCs/>
-                <w:sz w:val="18"/>
-                <w:szCs w:val="18"/>
-              </w:rPr>
-            </w:pPr>
-            <w:r>
-              <w:rPr>
-                <w:b/>
-                <w:bCs/>
-                <w:sz w:val="18"/>
-                <w:szCs w:val="18"/>
-              </w:rPr>
-              <w:t>N° do certificado de calibração</w:t>
+                <w:color w:val="11437E"/>
+                <w:sz w:val="18"/>
+                <w:szCs w:val="18"/>
+              </w:rPr>
+            </w:pPr>
+            <w:r>
+              <w:rPr>
+                <w:color w:val="11437E"/>
+                <w:sz w:val="18"/>
+                <w:szCs w:val="18"/>
+              </w:rPr>
+              <w:t>{{</w:t>
+            </w:r>
+            <w:proofErr w:type="spellStart"/>
+            <w:r>
+              <w:rPr>
+                <w:color w:val="11437E"/>
+                <w:sz w:val="18"/>
+                <w:szCs w:val="18"/>
+              </w:rPr>
+              <w:t>manometerscale</w:t>
+            </w:r>
+            <w:proofErr w:type="spellEnd"/>
+            <w:r>
+              <w:rPr>
+                <w:color w:val="11437E"/>
+                <w:sz w:val="18"/>
+                <w:szCs w:val="18"/>
+              </w:rPr>
+              <w:t>}}</w:t>
             </w:r>
           </w:p>
         </w:tc>
         <w:tc>
           <w:tcPr>
-            <w:tcW w:w="2409" w:type="dxa"/>
-            <w:shd w:val="clear" w:color="auto" w:fill="E8E8E8"/>
-            <w:vAlign w:val="center"/>
-          </w:tcPr>
-          <w:p>
-            <w:pPr>
-              <w:widowControl w:val="0"/>
-              <w:spacing w:line="216" w:lineRule="auto"/>
-              <w:jc w:val="center"/>
-              <w:rPr>
-                <w:b/>
-                <w:bCs/>
-                <w:sz w:val="18"/>
-                <w:szCs w:val="18"/>
-              </w:rPr>
-            </w:pPr>
-            <w:r>
-              <w:rPr>
-                <w:b/>
-                <w:bCs/>
-                <w:sz w:val="18"/>
-                <w:szCs w:val="18"/>
-              </w:rPr>
-              <w:t>Data de calibração</w:t>
-            </w:r>
-          </w:p>
-        </w:tc>
-        <w:tc>
-          <w:tcPr>
-            <w:tcW w:w="2417" w:type="dxa"/>
-            <w:shd w:val="clear" w:color="auto" w:fill="E8E8E8"/>
-            <w:vAlign w:val="center"/>
-          </w:tcPr>
-          <w:p>
-            <w:pPr>
-              <w:widowControl w:val="0"/>
-              <w:spacing w:line="216" w:lineRule="auto"/>
-              <w:jc w:val="center"/>
-              <w:rPr>
-                <w:b/>
-                <w:bCs/>
-                <w:sz w:val="18"/>
-                <w:szCs w:val="18"/>
-              </w:rPr>
-            </w:pPr>
-            <w:r>
-              <w:rPr>
-                <w:b/>
-                <w:bCs/>
-                <w:sz w:val="18"/>
-                <w:szCs w:val="18"/>
-              </w:rPr>
-              <w:t>Validade da calibração</w:t>
-            </w:r>
-          </w:p>
-        </w:tc>
-      </w:tr>
-      <w:tr>
-        <w:trPr>
-          <w:trHeight w:val="272"/>
-          <w:jc w:val="center"/>
-        </w:trPr>
-        <w:tc>
-          <w:tcPr>
-            <w:tcW w:w="2547" w:type="dxa"/>
+            <w:tcW w:w="2410" w:type="dxa"/>
             <w:shd w:val="clear" w:color="auto" w:fill="FFFFFF"/>
             <w:vAlign w:val="center"/>
           </w:tcPr>
@@ -1276,34 +1535,25 @@
                 <w:sz w:val="18"/>
                 <w:szCs w:val="18"/>
               </w:rPr>
-              <w:t>{{manometerscale}}</w:t>
-            </w:r>
-          </w:p>
-        </w:tc>
-        <w:tc>
-          <w:tcPr>
-            <w:tcW w:w="2977" w:type="dxa"/>
-            <w:shd w:val="clear" w:color="auto" w:fill="FFFFFF"/>
-            <w:vAlign w:val="center"/>
-          </w:tcPr>
-          <w:p>
-            <w:pPr>
-              <w:widowControl w:val="0"/>
-              <w:spacing w:line="216" w:lineRule="auto"/>
-              <w:jc w:val="center"/>
-              <w:rPr>
-                <w:color w:val="11437E"/>
-                <w:sz w:val="18"/>
-                <w:szCs w:val="18"/>
-              </w:rPr>
-            </w:pPr>
-            <w:r>
-              <w:rPr>
-                <w:color w:val="11437E"/>
-                <w:sz w:val="18"/>
-                <w:szCs w:val="18"/>
-              </w:rPr>
-              <w:t>{{manometercert}}</w:t>
+              <w:t>{{</w:t>
+            </w:r>
+            <w:proofErr w:type="spellStart"/>
+            <w:r>
+              <w:rPr>
+                <w:color w:val="11437E"/>
+                <w:sz w:val="18"/>
+                <w:szCs w:val="18"/>
+              </w:rPr>
+              <w:t>manometercert</w:t>
+            </w:r>
+            <w:proofErr w:type="spellEnd"/>
+            <w:r>
+              <w:rPr>
+                <w:color w:val="11437E"/>
+                <w:sz w:val="18"/>
+                <w:szCs w:val="18"/>
+              </w:rPr>
+              <w:t>}}</w:t>
             </w:r>
           </w:p>
         </w:tc>
@@ -1330,7 +1580,25 @@
                 <w:sz w:val="18"/>
                 <w:szCs w:val="18"/>
               </w:rPr>
-              <w:t>{{manometercalibration}}</w:t>
+              <w:t>{{</w:t>
+            </w:r>
+            <w:proofErr w:type="spellStart"/>
+            <w:r>
+              <w:rPr>
+                <w:color w:val="11437E"/>
+                <w:sz w:val="18"/>
+                <w:szCs w:val="18"/>
+              </w:rPr>
+              <w:t>manometercalibration</w:t>
+            </w:r>
+            <w:proofErr w:type="spellEnd"/>
+            <w:r>
+              <w:rPr>
+                <w:color w:val="11437E"/>
+                <w:sz w:val="18"/>
+                <w:szCs w:val="18"/>
+              </w:rPr>
+              <w:t>}}</w:t>
             </w:r>
           </w:p>
         </w:tc>
@@ -1357,7 +1625,25 @@
                 <w:sz w:val="18"/>
                 <w:szCs w:val="18"/>
               </w:rPr>
-              <w:t>{{manometerexpiring}}</w:t>
+              <w:t>{{</w:t>
+            </w:r>
+            <w:proofErr w:type="spellStart"/>
+            <w:r>
+              <w:rPr>
+                <w:color w:val="11437E"/>
+                <w:sz w:val="18"/>
+                <w:szCs w:val="18"/>
+              </w:rPr>
+              <w:t>manometerexpiring</w:t>
+            </w:r>
+            <w:proofErr w:type="spellEnd"/>
+            <w:r>
+              <w:rPr>
+                <w:color w:val="11437E"/>
+                <w:sz w:val="18"/>
+                <w:szCs w:val="18"/>
+              </w:rPr>
+              <w:t>}}</w:t>
             </w:r>
           </w:p>
         </w:tc>
@@ -1473,6 +1759,7 @@
               </w:rPr>
               <w:t>{{</w:t>
             </w:r>
+            <w:proofErr w:type="spellStart"/>
             <w:r>
               <w:rPr>
                 <w:color w:val="11437E"/>
@@ -1481,6 +1768,7 @@
               </w:rPr>
               <w:t>manometerphotos</w:t>
             </w:r>
+            <w:proofErr w:type="spellEnd"/>
             <w:r>
               <w:rPr>
                 <w:color w:val="11437E"/>
@@ -1661,7 +1949,6 @@
                 <w:sz w:val="18"/>
                 <w:szCs w:val="18"/>
               </w:rPr>
-              <w:lastRenderedPageBreak/>
               <w:t>FOTOS DO SISTEMA</w:t>
             </w:r>
           </w:p>
@@ -1693,7 +1980,25 @@
                 <w:sz w:val="18"/>
                 <w:szCs w:val="18"/>
               </w:rPr>
-              <w:t>{{systemphotos}}</w:t>
+              <w:t>{{</w:t>
+            </w:r>
+            <w:proofErr w:type="spellStart"/>
+            <w:r>
+              <w:rPr>
+                <w:color w:val="11437E"/>
+                <w:sz w:val="18"/>
+                <w:szCs w:val="18"/>
+              </w:rPr>
+              <w:t>systemphotos</w:t>
+            </w:r>
+            <w:proofErr w:type="spellEnd"/>
+            <w:r>
+              <w:rPr>
+                <w:color w:val="11437E"/>
+                <w:sz w:val="18"/>
+                <w:szCs w:val="18"/>
+              </w:rPr>
+              <w:t>}}</w:t>
             </w:r>
           </w:p>
         </w:tc>
@@ -2052,7 +2357,25 @@
                 <w:sz w:val="18"/>
                 <w:szCs w:val="18"/>
               </w:rPr>
-              <w:t>{{obs}}</w:t>
+              <w:t>{{</w:t>
+            </w:r>
+            <w:proofErr w:type="spellStart"/>
+            <w:r>
+              <w:rPr>
+                <w:color w:val="11437E"/>
+                <w:sz w:val="18"/>
+                <w:szCs w:val="18"/>
+              </w:rPr>
+              <w:t>obs</w:t>
+            </w:r>
+            <w:proofErr w:type="spellEnd"/>
+            <w:r>
+              <w:rPr>
+                <w:color w:val="11437E"/>
+                <w:sz w:val="18"/>
+                <w:szCs w:val="18"/>
+              </w:rPr>
+              <w:t>}}</w:t>
             </w:r>
           </w:p>
         </w:tc>
@@ -2158,7 +2481,21 @@
               <w:rPr>
                 <w:color w:val="11437E"/>
               </w:rPr>
-              <w:t xml:space="preserve"> {{leadername}}</w:t>
+              <w:t xml:space="preserve"> {{</w:t>
+            </w:r>
+            <w:proofErr w:type="spellStart"/>
+            <w:r>
+              <w:rPr>
+                <w:color w:val="11437E"/>
+              </w:rPr>
+              <w:t>leadername</w:t>
+            </w:r>
+            <w:proofErr w:type="spellEnd"/>
+            <w:r>
+              <w:rPr>
+                <w:color w:val="11437E"/>
+              </w:rPr>
+              <w:t>}}</w:t>
             </w:r>
           </w:p>
           <w:p>
@@ -2180,7 +2517,21 @@
               <w:rPr>
                 <w:color w:val="11437E"/>
               </w:rPr>
-              <w:t>{{leaderposition}}</w:t>
+              <w:t>{{</w:t>
+            </w:r>
+            <w:proofErr w:type="spellStart"/>
+            <w:r>
+              <w:rPr>
+                <w:color w:val="11437E"/>
+              </w:rPr>
+              <w:t>leaderposition</w:t>
+            </w:r>
+            <w:proofErr w:type="spellEnd"/>
+            <w:r>
+              <w:rPr>
+                <w:color w:val="11437E"/>
+              </w:rPr>
+              <w:t>}}</w:t>
             </w:r>
           </w:p>
         </w:tc>
@@ -2849,6 +3200,7 @@
             </w:rPr>
             <w:t>{{</w:t>
           </w:r>
+          <w:proofErr w:type="spellStart"/>
           <w:r>
             <w:rPr>
               <w:b/>
@@ -2857,6 +3209,7 @@
             </w:rPr>
             <w:t>missiontitle</w:t>
           </w:r>
+          <w:proofErr w:type="spellEnd"/>
           <w:r>
             <w:rPr>
               <w:b/>
@@ -2900,7 +3253,29 @@
               <w:sz w:val="18"/>
               <w:szCs w:val="18"/>
             </w:rPr>
-            <w:t>{{client}}</w:t>
+            <w:t>{{</w:t>
+          </w:r>
+          <w:proofErr w:type="spellStart"/>
+          <w:r>
+            <w:rPr>
+              <w:b/>
+              <w:bCs/>
+              <w:color w:val="11437E"/>
+              <w:sz w:val="18"/>
+              <w:szCs w:val="18"/>
+            </w:rPr>
+            <w:t>client</w:t>
+          </w:r>
+          <w:proofErr w:type="spellEnd"/>
+          <w:r>
+            <w:rPr>
+              <w:b/>
+              <w:bCs/>
+              <w:color w:val="11437E"/>
+              <w:sz w:val="18"/>
+              <w:szCs w:val="18"/>
+            </w:rPr>
+            <w:t>}}</w:t>
           </w:r>
         </w:p>
       </w:tc>
@@ -2928,7 +3303,29 @@
               <w:sz w:val="18"/>
               <w:szCs w:val="18"/>
             </w:rPr>
-            <w:t>{{proposal}}</w:t>
+            <w:t>{{</w:t>
+          </w:r>
+          <w:proofErr w:type="spellStart"/>
+          <w:r>
+            <w:rPr>
+              <w:b/>
+              <w:bCs/>
+              <w:color w:val="11437E"/>
+              <w:sz w:val="18"/>
+              <w:szCs w:val="18"/>
+            </w:rPr>
+            <w:t>proposal</w:t>
+          </w:r>
+          <w:proofErr w:type="spellEnd"/>
+          <w:r>
+            <w:rPr>
+              <w:b/>
+              <w:bCs/>
+              <w:color w:val="11437E"/>
+              <w:sz w:val="18"/>
+              <w:szCs w:val="18"/>
+            </w:rPr>
+            <w:t>}}</w:t>
           </w:r>
         </w:p>
       </w:tc>
@@ -2974,7 +3371,18 @@
               <w:sz w:val="18"/>
               <w:szCs w:val="18"/>
             </w:rPr>
-            <w:t>{{r</w:t>
+            <w:t>{{</w:t>
+          </w:r>
+          <w:proofErr w:type="spellStart"/>
+          <w:r>
+            <w:rPr>
+              <w:b/>
+              <w:bCs/>
+              <w:color w:val="11437E"/>
+              <w:sz w:val="18"/>
+              <w:szCs w:val="18"/>
+            </w:rPr>
+            <w:t>r</w:t>
           </w:r>
           <w:r>
             <w:rPr>
@@ -2986,6 +3394,7 @@
             </w:rPr>
             <w:t>tp</w:t>
           </w:r>
+          <w:proofErr w:type="spellEnd"/>
           <w:r>
             <w:rPr>
               <w:b/>
@@ -3028,7 +3437,29 @@
               <w:sz w:val="18"/>
               <w:szCs w:val="18"/>
             </w:rPr>
-            <w:t xml:space="preserve"> {{cnpj}}</w:t>
+            <w:t xml:space="preserve"> {{</w:t>
+          </w:r>
+          <w:proofErr w:type="spellStart"/>
+          <w:r>
+            <w:rPr>
+              <w:b/>
+              <w:bCs/>
+              <w:color w:val="11437E"/>
+              <w:sz w:val="18"/>
+              <w:szCs w:val="18"/>
+            </w:rPr>
+            <w:t>cnpj</w:t>
+          </w:r>
+          <w:proofErr w:type="spellEnd"/>
+          <w:r>
+            <w:rPr>
+              <w:b/>
+              <w:bCs/>
+              <w:color w:val="11437E"/>
+              <w:sz w:val="18"/>
+              <w:szCs w:val="18"/>
+            </w:rPr>
+            <w:t>}}</w:t>
           </w:r>
         </w:p>
       </w:tc>

</xml_diff>

<commit_message>
fix: preencher tag do manometro no RTP (#215)
</commit_message>
<xml_diff>
--- a/Modelos/definitivos/Modelo - RTP.docx
+++ b/Modelos/definitivos/Modelo - RTP.docx
@@ -114,7 +114,25 @@
                 <w:sz w:val="18"/>
                 <w:szCs w:val="18"/>
               </w:rPr>
-              <w:t>{{equipament}}</w:t>
+              <w:t>{{</w:t>
+            </w:r>
+            <w:proofErr w:type="spellStart"/>
+            <w:r>
+              <w:rPr>
+                <w:color w:val="11437E"/>
+                <w:sz w:val="18"/>
+                <w:szCs w:val="18"/>
+              </w:rPr>
+              <w:t>equipament</w:t>
+            </w:r>
+            <w:proofErr w:type="spellEnd"/>
+            <w:r>
+              <w:rPr>
+                <w:color w:val="11437E"/>
+                <w:sz w:val="18"/>
+                <w:szCs w:val="18"/>
+              </w:rPr>
+              <w:t>}}</w:t>
             </w:r>
           </w:p>
         </w:tc>
@@ -173,6 +191,7 @@
               </w:rPr>
               <w:t>{{</w:t>
             </w:r>
+            <w:proofErr w:type="spellStart"/>
             <w:r>
               <w:rPr>
                 <w:color w:val="11437E"/>
@@ -181,6 +200,7 @@
               </w:rPr>
               <w:t>fluid</w:t>
             </w:r>
+            <w:proofErr w:type="spellEnd"/>
             <w:r>
               <w:rPr>
                 <w:color w:val="11437E"/>
@@ -237,6 +257,7 @@
               </w:rPr>
               <w:t>{{</w:t>
             </w:r>
+            <w:proofErr w:type="spellStart"/>
             <w:r>
               <w:rPr>
                 <w:color w:val="11437E"/>
@@ -245,6 +266,7 @@
               </w:rPr>
               <w:t>projectpressure</w:t>
             </w:r>
+            <w:proofErr w:type="spellEnd"/>
             <w:r>
               <w:rPr>
                 <w:color w:val="11437E"/>
@@ -311,6 +333,7 @@
               </w:rPr>
               <w:t>{{</w:t>
             </w:r>
+            <w:proofErr w:type="spellStart"/>
             <w:r>
               <w:rPr>
                 <w:color w:val="11437E"/>
@@ -319,6 +342,7 @@
               </w:rPr>
               <w:t>testpressure</w:t>
             </w:r>
+            <w:proofErr w:type="spellEnd"/>
             <w:r>
               <w:rPr>
                 <w:color w:val="11437E"/>
@@ -419,6 +443,7 @@
               </w:rPr>
               <w:t>{{</w:t>
             </w:r>
+            <w:proofErr w:type="spellStart"/>
             <w:r>
               <w:rPr>
                 <w:color w:val="11437E"/>
@@ -427,6 +452,7 @@
               </w:rPr>
               <w:t>testunit</w:t>
             </w:r>
+            <w:proofErr w:type="spellEnd"/>
             <w:r>
               <w:rPr>
                 <w:color w:val="11437E"/>
@@ -483,13 +509,23 @@
               </w:rPr>
               <w:t>{{</w:t>
             </w:r>
-            <w:r>
-              <w:rPr>
-                <w:color w:val="11437E"/>
-                <w:sz w:val="18"/>
-                <w:szCs w:val="18"/>
-              </w:rPr>
-              <w:t>starttime}</w:t>
+            <w:proofErr w:type="spellStart"/>
+            <w:r>
+              <w:rPr>
+                <w:color w:val="11437E"/>
+                <w:sz w:val="18"/>
+                <w:szCs w:val="18"/>
+              </w:rPr>
+              <w:t>starttime</w:t>
+            </w:r>
+            <w:proofErr w:type="spellEnd"/>
+            <w:r>
+              <w:rPr>
+                <w:color w:val="11437E"/>
+                <w:sz w:val="18"/>
+                <w:szCs w:val="18"/>
+              </w:rPr>
+              <w:t>}</w:t>
             </w:r>
             <w:r>
               <w:rPr>
@@ -559,6 +595,7 @@
               </w:rPr>
               <w:t>{{</w:t>
             </w:r>
+            <w:proofErr w:type="spellStart"/>
             <w:r>
               <w:rPr>
                 <w:color w:val="11437E"/>
@@ -567,6 +604,7 @@
               </w:rPr>
               <w:t>endtime</w:t>
             </w:r>
+            <w:proofErr w:type="spellEnd"/>
             <w:r>
               <w:rPr>
                 <w:color w:val="11437E"/>
@@ -607,22 +645,51 @@
                 <w:szCs w:val="18"/>
               </w:rPr>
             </w:pPr>
-            <w:r>
-              <w:rPr>
-                <w:b/>
-                <w:bCs/>
-                <w:sz w:val="18"/>
-                <w:szCs w:val="18"/>
-              </w:rPr>
-              <w:t xml:space="preserve">Tags: </w:t>
-            </w:r>
-            <w:r>
-              <w:rPr>
-                <w:color w:val="11437E"/>
-                <w:sz w:val="18"/>
-                <w:szCs w:val="18"/>
-              </w:rPr>
-              <w:t>{{tags}}</w:t>
+            <w:proofErr w:type="spellStart"/>
+            <w:r>
+              <w:rPr>
+                <w:b/>
+                <w:bCs/>
+                <w:sz w:val="18"/>
+                <w:szCs w:val="18"/>
+              </w:rPr>
+              <w:t>Tags</w:t>
+            </w:r>
+            <w:proofErr w:type="spellEnd"/>
+            <w:r>
+              <w:rPr>
+                <w:b/>
+                <w:bCs/>
+                <w:sz w:val="18"/>
+                <w:szCs w:val="18"/>
+              </w:rPr>
+              <w:t xml:space="preserve">: </w:t>
+            </w:r>
+            <w:r>
+              <w:rPr>
+                <w:color w:val="11437E"/>
+                <w:sz w:val="18"/>
+                <w:szCs w:val="18"/>
+              </w:rPr>
+              <w:t>{{</w:t>
+            </w:r>
+            <w:proofErr w:type="spellStart"/>
+            <w:r>
+              <w:rPr>
+                <w:color w:val="11437E"/>
+                <w:sz w:val="18"/>
+                <w:szCs w:val="18"/>
+              </w:rPr>
+              <w:t>tags</w:t>
+            </w:r>
+            <w:proofErr w:type="spellEnd"/>
+            <w:r>
+              <w:rPr>
+                <w:color w:val="11437E"/>
+                <w:sz w:val="18"/>
+                <w:szCs w:val="18"/>
+              </w:rPr>
+              <w:t>}}</w:t>
             </w:r>
           </w:p>
         </w:tc>
@@ -673,6 +740,7 @@
               </w:rPr>
               <w:t>{{</w:t>
             </w:r>
+            <w:proofErr w:type="spellStart"/>
             <w:r>
               <w:rPr>
                 <w:color w:val="11437E"/>
@@ -681,6 +749,7 @@
               </w:rPr>
               <w:t>rtp</w:t>
             </w:r>
+            <w:proofErr w:type="spellEnd"/>
             <w:r>
               <w:rPr>
                 <w:color w:val="11437E"/>
@@ -848,7 +917,25 @@
                 <w:sz w:val="18"/>
                 <w:szCs w:val="18"/>
               </w:rPr>
-              <w:t>{{diameter}}</w:t>
+              <w:t>{{</w:t>
+            </w:r>
+            <w:proofErr w:type="spellStart"/>
+            <w:r>
+              <w:rPr>
+                <w:color w:val="11437E"/>
+                <w:sz w:val="18"/>
+                <w:szCs w:val="18"/>
+              </w:rPr>
+              <w:t>diameter</w:t>
+            </w:r>
+            <w:proofErr w:type="spellEnd"/>
+            <w:r>
+              <w:rPr>
+                <w:color w:val="11437E"/>
+                <w:sz w:val="18"/>
+                <w:szCs w:val="18"/>
+              </w:rPr>
+              <w:t>}}</w:t>
             </w:r>
           </w:p>
         </w:tc>
@@ -868,7 +955,25 @@
                 <w:sz w:val="18"/>
                 <w:szCs w:val="18"/>
               </w:rPr>
-              <w:t>{{length}}</w:t>
+              <w:t>{{</w:t>
+            </w:r>
+            <w:proofErr w:type="spellStart"/>
+            <w:r>
+              <w:rPr>
+                <w:color w:val="11437E"/>
+                <w:sz w:val="18"/>
+                <w:szCs w:val="18"/>
+              </w:rPr>
+              <w:t>length</w:t>
+            </w:r>
+            <w:proofErr w:type="spellEnd"/>
+            <w:r>
+              <w:rPr>
+                <w:color w:val="11437E"/>
+                <w:sz w:val="18"/>
+                <w:szCs w:val="18"/>
+              </w:rPr>
+              <w:t>}}</w:t>
             </w:r>
           </w:p>
         </w:tc>
@@ -1029,7 +1134,25 @@
                 <w:sz w:val="18"/>
                 <w:szCs w:val="18"/>
               </w:rPr>
-              <w:t>{{collaboratorname}}</w:t>
+              <w:t>{{</w:t>
+            </w:r>
+            <w:proofErr w:type="spellStart"/>
+            <w:r>
+              <w:rPr>
+                <w:color w:val="11437E"/>
+                <w:sz w:val="18"/>
+                <w:szCs w:val="18"/>
+              </w:rPr>
+              <w:t>collaboratorname</w:t>
+            </w:r>
+            <w:proofErr w:type="spellEnd"/>
+            <w:r>
+              <w:rPr>
+                <w:color w:val="11437E"/>
+                <w:sz w:val="18"/>
+                <w:szCs w:val="18"/>
+              </w:rPr>
+              <w:t>}}</w:t>
             </w:r>
           </w:p>
         </w:tc>
@@ -1055,7 +1178,25 @@
                 <w:sz w:val="18"/>
                 <w:szCs w:val="18"/>
               </w:rPr>
-              <w:t>{{collaboratorposition}}</w:t>
+              <w:t>{{</w:t>
+            </w:r>
+            <w:proofErr w:type="spellStart"/>
+            <w:r>
+              <w:rPr>
+                <w:color w:val="11437E"/>
+                <w:sz w:val="18"/>
+                <w:szCs w:val="18"/>
+              </w:rPr>
+              <w:t>collaboratorposition</w:t>
+            </w:r>
+            <w:proofErr w:type="spellEnd"/>
+            <w:r>
+              <w:rPr>
+                <w:color w:val="11437E"/>
+                <w:sz w:val="18"/>
+                <w:szCs w:val="18"/>
+              </w:rPr>
+              <w:t>}}</w:t>
             </w:r>
           </w:p>
         </w:tc>
@@ -1082,8 +1223,9 @@
         <w:tblLook w:val="0600" w:firstRow="0" w:lastRow="0" w:firstColumn="0" w:lastColumn="0" w:noHBand="1" w:noVBand="1"/>
       </w:tblPr>
       <w:tblGrid>
-        <w:gridCol w:w="2547"/>
-        <w:gridCol w:w="2977"/>
+        <w:gridCol w:w="1273"/>
+        <w:gridCol w:w="1841"/>
+        <w:gridCol w:w="2410"/>
         <w:gridCol w:w="2409"/>
         <w:gridCol w:w="2417"/>
       </w:tblGrid>
@@ -1096,7 +1238,7 @@
         <w:tc>
           <w:tcPr>
             <w:tcW w:w="10350" w:type="dxa"/>
-            <w:gridSpan w:val="4"/>
+            <w:gridSpan w:val="5"/>
             <w:shd w:val="clear" w:color="auto" w:fill="30503E"/>
             <w:vAlign w:val="center"/>
           </w:tcPr>
@@ -1122,6 +1264,157 @@
                 <w:szCs w:val="18"/>
               </w:rPr>
               <w:t>MANÔMETROS</w:t>
+            </w:r>
+          </w:p>
+        </w:tc>
+      </w:tr>
+      <w:tr>
+        <w:trPr>
+          <w:trHeight w:val="251"/>
+          <w:jc w:val="center"/>
+        </w:trPr>
+        <w:tc>
+          <w:tcPr>
+            <w:tcW w:w="1273" w:type="dxa"/>
+            <w:shd w:val="clear" w:color="auto" w:fill="E8E8E8"/>
+            <w:vAlign w:val="center"/>
+          </w:tcPr>
+          <w:p>
+            <w:pPr>
+              <w:widowControl w:val="0"/>
+              <w:spacing w:line="216" w:lineRule="auto"/>
+              <w:jc w:val="center"/>
+              <w:rPr>
+                <w:b/>
+                <w:bCs/>
+                <w:sz w:val="18"/>
+                <w:szCs w:val="18"/>
+              </w:rPr>
+            </w:pPr>
+            <w:r>
+              <w:rPr>
+                <w:b/>
+                <w:bCs/>
+                <w:sz w:val="18"/>
+                <w:szCs w:val="18"/>
+              </w:rPr>
+              <w:t>TAG</w:t>
+            </w:r>
+          </w:p>
+        </w:tc>
+        <w:tc>
+          <w:tcPr>
+            <w:tcW w:w="1841" w:type="dxa"/>
+            <w:shd w:val="clear" w:color="auto" w:fill="E8E8E8"/>
+            <w:vAlign w:val="center"/>
+          </w:tcPr>
+          <w:p>
+            <w:pPr>
+              <w:widowControl w:val="0"/>
+              <w:spacing w:line="216" w:lineRule="auto"/>
+              <w:jc w:val="center"/>
+              <w:rPr>
+                <w:b/>
+                <w:bCs/>
+                <w:sz w:val="18"/>
+                <w:szCs w:val="18"/>
+              </w:rPr>
+            </w:pPr>
+            <w:r>
+              <w:rPr>
+                <w:b/>
+                <w:bCs/>
+                <w:sz w:val="18"/>
+                <w:szCs w:val="18"/>
+              </w:rPr>
+              <w:t>Escala do manômetro</w:t>
+            </w:r>
+          </w:p>
+        </w:tc>
+        <w:tc>
+          <w:tcPr>
+            <w:tcW w:w="2410" w:type="dxa"/>
+            <w:shd w:val="clear" w:color="auto" w:fill="E8E8E8"/>
+            <w:vAlign w:val="center"/>
+          </w:tcPr>
+          <w:p>
+            <w:pPr>
+              <w:widowControl w:val="0"/>
+              <w:spacing w:line="216" w:lineRule="auto"/>
+              <w:jc w:val="center"/>
+              <w:rPr>
+                <w:b/>
+                <w:bCs/>
+                <w:sz w:val="18"/>
+                <w:szCs w:val="18"/>
+              </w:rPr>
+            </w:pPr>
+            <w:r>
+              <w:rPr>
+                <w:b/>
+                <w:bCs/>
+                <w:sz w:val="18"/>
+                <w:szCs w:val="18"/>
+              </w:rPr>
+              <w:t>N° do certificado de calibração</w:t>
+            </w:r>
+          </w:p>
+        </w:tc>
+        <w:tc>
+          <w:tcPr>
+            <w:tcW w:w="2409" w:type="dxa"/>
+            <w:shd w:val="clear" w:color="auto" w:fill="E8E8E8"/>
+            <w:vAlign w:val="center"/>
+          </w:tcPr>
+          <w:p>
+            <w:pPr>
+              <w:widowControl w:val="0"/>
+              <w:spacing w:line="216" w:lineRule="auto"/>
+              <w:jc w:val="center"/>
+              <w:rPr>
+                <w:b/>
+                <w:bCs/>
+                <w:sz w:val="18"/>
+                <w:szCs w:val="18"/>
+              </w:rPr>
+            </w:pPr>
+            <w:r>
+              <w:rPr>
+                <w:b/>
+                <w:bCs/>
+                <w:sz w:val="18"/>
+                <w:szCs w:val="18"/>
+              </w:rPr>
+              <w:t>Data de calibração</w:t>
+            </w:r>
+          </w:p>
+        </w:tc>
+        <w:tc>
+          <w:tcPr>
+            <w:tcW w:w="2417" w:type="dxa"/>
+            <w:shd w:val="clear" w:color="auto" w:fill="E8E8E8"/>
+            <w:vAlign w:val="center"/>
+          </w:tcPr>
+          <w:p>
+            <w:pPr>
+              <w:widowControl w:val="0"/>
+              <w:spacing w:line="216" w:lineRule="auto"/>
+              <w:jc w:val="center"/>
+              <w:rPr>
+                <w:b/>
+                <w:bCs/>
+                <w:sz w:val="18"/>
+                <w:szCs w:val="18"/>
+              </w:rPr>
+            </w:pPr>
+            <w:r>
+              <w:rPr>
+                <w:b/>
+                <w:bCs/>
+                <w:sz w:val="18"/>
+                <w:szCs w:val="18"/>
+              </w:rPr>
+              <w:t>Validade da calibração</w:t>
             </w:r>
           </w:p>
         </w:tc>
@@ -1133,8 +1426,7 @@
         </w:trPr>
         <w:tc>
           <w:tcPr>
-            <w:tcW w:w="2547" w:type="dxa"/>
-            <w:shd w:val="clear" w:color="auto" w:fill="E8E8E8"/>
+            <w:tcW w:w="1273" w:type="dxa"/>
             <w:vAlign w:val="center"/>
           </w:tcPr>
           <w:p>
@@ -1143,27 +1435,42 @@
               <w:spacing w:line="216" w:lineRule="auto"/>
               <w:jc w:val="center"/>
               <w:rPr>
-                <w:b/>
-                <w:bCs/>
-                <w:sz w:val="18"/>
-                <w:szCs w:val="18"/>
-              </w:rPr>
-            </w:pPr>
-            <w:r>
-              <w:rPr>
-                <w:b/>
-                <w:bCs/>
-                <w:sz w:val="18"/>
-                <w:szCs w:val="18"/>
-              </w:rPr>
-              <w:t>Escala do manômetro</w:t>
+                <w:color w:val="11437E"/>
+                <w:sz w:val="18"/>
+                <w:szCs w:val="18"/>
+              </w:rPr>
+            </w:pPr>
+            <w:r>
+              <w:rPr>
+                <w:color w:val="11437E"/>
+                <w:sz w:val="18"/>
+                <w:szCs w:val="18"/>
+              </w:rPr>
+              <w:t>{{</w:t>
+            </w:r>
+            <w:proofErr w:type="spellStart"/>
+            <w:r>
+              <w:rPr>
+                <w:color w:val="11437E"/>
+                <w:sz w:val="18"/>
+                <w:szCs w:val="18"/>
+              </w:rPr>
+              <w:t>manometer_tag</w:t>
+            </w:r>
+            <w:proofErr w:type="spellEnd"/>
+            <w:r>
+              <w:rPr>
+                <w:color w:val="11437E"/>
+                <w:sz w:val="18"/>
+                <w:szCs w:val="18"/>
+              </w:rPr>
+              <w:t>}}</w:t>
             </w:r>
           </w:p>
         </w:tc>
         <w:tc>
           <w:tcPr>
-            <w:tcW w:w="2977" w:type="dxa"/>
-            <w:shd w:val="clear" w:color="auto" w:fill="E8E8E8"/>
+            <w:tcW w:w="1841" w:type="dxa"/>
             <w:vAlign w:val="center"/>
           </w:tcPr>
           <w:p>
@@ -1172,90 +1479,42 @@
               <w:spacing w:line="216" w:lineRule="auto"/>
               <w:jc w:val="center"/>
               <w:rPr>
-                <w:b/>
-                <w:bCs/>
-                <w:sz w:val="18"/>
-                <w:szCs w:val="18"/>
-              </w:rPr>
-            </w:pPr>
-            <w:r>
-              <w:rPr>
-                <w:b/>
-                <w:bCs/>
-                <w:sz w:val="18"/>
-                <w:szCs w:val="18"/>
-              </w:rPr>
-              <w:t>N° do certificado de calibração</w:t>
+                <w:color w:val="11437E"/>
+                <w:sz w:val="18"/>
+                <w:szCs w:val="18"/>
+              </w:rPr>
+            </w:pPr>
+            <w:r>
+              <w:rPr>
+                <w:color w:val="11437E"/>
+                <w:sz w:val="18"/>
+                <w:szCs w:val="18"/>
+              </w:rPr>
+              <w:t>{{</w:t>
+            </w:r>
+            <w:proofErr w:type="spellStart"/>
+            <w:r>
+              <w:rPr>
+                <w:color w:val="11437E"/>
+                <w:sz w:val="18"/>
+                <w:szCs w:val="18"/>
+              </w:rPr>
+              <w:t>manometerscale</w:t>
+            </w:r>
+            <w:proofErr w:type="spellEnd"/>
+            <w:r>
+              <w:rPr>
+                <w:color w:val="11437E"/>
+                <w:sz w:val="18"/>
+                <w:szCs w:val="18"/>
+              </w:rPr>
+              <w:t>}}</w:t>
             </w:r>
           </w:p>
         </w:tc>
         <w:tc>
           <w:tcPr>
-            <w:tcW w:w="2409" w:type="dxa"/>
-            <w:shd w:val="clear" w:color="auto" w:fill="E8E8E8"/>
-            <w:vAlign w:val="center"/>
-          </w:tcPr>
-          <w:p>
-            <w:pPr>
-              <w:widowControl w:val="0"/>
-              <w:spacing w:line="216" w:lineRule="auto"/>
-              <w:jc w:val="center"/>
-              <w:rPr>
-                <w:b/>
-                <w:bCs/>
-                <w:sz w:val="18"/>
-                <w:szCs w:val="18"/>
-              </w:rPr>
-            </w:pPr>
-            <w:r>
-              <w:rPr>
-                <w:b/>
-                <w:bCs/>
-                <w:sz w:val="18"/>
-                <w:szCs w:val="18"/>
-              </w:rPr>
-              <w:t>Data de calibração</w:t>
-            </w:r>
-          </w:p>
-        </w:tc>
-        <w:tc>
-          <w:tcPr>
-            <w:tcW w:w="2417" w:type="dxa"/>
-            <w:shd w:val="clear" w:color="auto" w:fill="E8E8E8"/>
-            <w:vAlign w:val="center"/>
-          </w:tcPr>
-          <w:p>
-            <w:pPr>
-              <w:widowControl w:val="0"/>
-              <w:spacing w:line="216" w:lineRule="auto"/>
-              <w:jc w:val="center"/>
-              <w:rPr>
-                <w:b/>
-                <w:bCs/>
-                <w:sz w:val="18"/>
-                <w:szCs w:val="18"/>
-              </w:rPr>
-            </w:pPr>
-            <w:r>
-              <w:rPr>
-                <w:b/>
-                <w:bCs/>
-                <w:sz w:val="18"/>
-                <w:szCs w:val="18"/>
-              </w:rPr>
-              <w:t>Validade da calibração</w:t>
-            </w:r>
-          </w:p>
-        </w:tc>
-      </w:tr>
-      <w:tr>
-        <w:trPr>
-          <w:trHeight w:val="272"/>
-          <w:jc w:val="center"/>
-        </w:trPr>
-        <w:tc>
-          <w:tcPr>
-            <w:tcW w:w="2547" w:type="dxa"/>
+            <w:tcW w:w="2410" w:type="dxa"/>
             <w:shd w:val="clear" w:color="auto" w:fill="FFFFFF"/>
             <w:vAlign w:val="center"/>
           </w:tcPr>
@@ -1276,34 +1535,25 @@
                 <w:sz w:val="18"/>
                 <w:szCs w:val="18"/>
               </w:rPr>
-              <w:t>{{manometerscale}}</w:t>
-            </w:r>
-          </w:p>
-        </w:tc>
-        <w:tc>
-          <w:tcPr>
-            <w:tcW w:w="2977" w:type="dxa"/>
-            <w:shd w:val="clear" w:color="auto" w:fill="FFFFFF"/>
-            <w:vAlign w:val="center"/>
-          </w:tcPr>
-          <w:p>
-            <w:pPr>
-              <w:widowControl w:val="0"/>
-              <w:spacing w:line="216" w:lineRule="auto"/>
-              <w:jc w:val="center"/>
-              <w:rPr>
-                <w:color w:val="11437E"/>
-                <w:sz w:val="18"/>
-                <w:szCs w:val="18"/>
-              </w:rPr>
-            </w:pPr>
-            <w:r>
-              <w:rPr>
-                <w:color w:val="11437E"/>
-                <w:sz w:val="18"/>
-                <w:szCs w:val="18"/>
-              </w:rPr>
-              <w:t>{{manometercert}}</w:t>
+              <w:t>{{</w:t>
+            </w:r>
+            <w:proofErr w:type="spellStart"/>
+            <w:r>
+              <w:rPr>
+                <w:color w:val="11437E"/>
+                <w:sz w:val="18"/>
+                <w:szCs w:val="18"/>
+              </w:rPr>
+              <w:t>manometercert</w:t>
+            </w:r>
+            <w:proofErr w:type="spellEnd"/>
+            <w:r>
+              <w:rPr>
+                <w:color w:val="11437E"/>
+                <w:sz w:val="18"/>
+                <w:szCs w:val="18"/>
+              </w:rPr>
+              <w:t>}}</w:t>
             </w:r>
           </w:p>
         </w:tc>
@@ -1330,7 +1580,25 @@
                 <w:sz w:val="18"/>
                 <w:szCs w:val="18"/>
               </w:rPr>
-              <w:t>{{manometercalibration}}</w:t>
+              <w:t>{{</w:t>
+            </w:r>
+            <w:proofErr w:type="spellStart"/>
+            <w:r>
+              <w:rPr>
+                <w:color w:val="11437E"/>
+                <w:sz w:val="18"/>
+                <w:szCs w:val="18"/>
+              </w:rPr>
+              <w:t>manometercalibration</w:t>
+            </w:r>
+            <w:proofErr w:type="spellEnd"/>
+            <w:r>
+              <w:rPr>
+                <w:color w:val="11437E"/>
+                <w:sz w:val="18"/>
+                <w:szCs w:val="18"/>
+              </w:rPr>
+              <w:t>}}</w:t>
             </w:r>
           </w:p>
         </w:tc>
@@ -1357,7 +1625,25 @@
                 <w:sz w:val="18"/>
                 <w:szCs w:val="18"/>
               </w:rPr>
-              <w:t>{{manometerexpiring}}</w:t>
+              <w:t>{{</w:t>
+            </w:r>
+            <w:proofErr w:type="spellStart"/>
+            <w:r>
+              <w:rPr>
+                <w:color w:val="11437E"/>
+                <w:sz w:val="18"/>
+                <w:szCs w:val="18"/>
+              </w:rPr>
+              <w:t>manometerexpiring</w:t>
+            </w:r>
+            <w:proofErr w:type="spellEnd"/>
+            <w:r>
+              <w:rPr>
+                <w:color w:val="11437E"/>
+                <w:sz w:val="18"/>
+                <w:szCs w:val="18"/>
+              </w:rPr>
+              <w:t>}}</w:t>
             </w:r>
           </w:p>
         </w:tc>
@@ -1473,6 +1759,7 @@
               </w:rPr>
               <w:t>{{</w:t>
             </w:r>
+            <w:proofErr w:type="spellStart"/>
             <w:r>
               <w:rPr>
                 <w:color w:val="11437E"/>
@@ -1481,6 +1768,7 @@
               </w:rPr>
               <w:t>manometerphotos</w:t>
             </w:r>
+            <w:proofErr w:type="spellEnd"/>
             <w:r>
               <w:rPr>
                 <w:color w:val="11437E"/>
@@ -1661,7 +1949,6 @@
                 <w:sz w:val="18"/>
                 <w:szCs w:val="18"/>
               </w:rPr>
-              <w:lastRenderedPageBreak/>
               <w:t>FOTOS DO SISTEMA</w:t>
             </w:r>
           </w:p>
@@ -1693,7 +1980,25 @@
                 <w:sz w:val="18"/>
                 <w:szCs w:val="18"/>
               </w:rPr>
-              <w:t>{{systemphotos}}</w:t>
+              <w:t>{{</w:t>
+            </w:r>
+            <w:proofErr w:type="spellStart"/>
+            <w:r>
+              <w:rPr>
+                <w:color w:val="11437E"/>
+                <w:sz w:val="18"/>
+                <w:szCs w:val="18"/>
+              </w:rPr>
+              <w:t>systemphotos</w:t>
+            </w:r>
+            <w:proofErr w:type="spellEnd"/>
+            <w:r>
+              <w:rPr>
+                <w:color w:val="11437E"/>
+                <w:sz w:val="18"/>
+                <w:szCs w:val="18"/>
+              </w:rPr>
+              <w:t>}}</w:t>
             </w:r>
           </w:p>
         </w:tc>
@@ -2052,7 +2357,25 @@
                 <w:sz w:val="18"/>
                 <w:szCs w:val="18"/>
               </w:rPr>
-              <w:t>{{obs}}</w:t>
+              <w:t>{{</w:t>
+            </w:r>
+            <w:proofErr w:type="spellStart"/>
+            <w:r>
+              <w:rPr>
+                <w:color w:val="11437E"/>
+                <w:sz w:val="18"/>
+                <w:szCs w:val="18"/>
+              </w:rPr>
+              <w:t>obs</w:t>
+            </w:r>
+            <w:proofErr w:type="spellEnd"/>
+            <w:r>
+              <w:rPr>
+                <w:color w:val="11437E"/>
+                <w:sz w:val="18"/>
+                <w:szCs w:val="18"/>
+              </w:rPr>
+              <w:t>}}</w:t>
             </w:r>
           </w:p>
         </w:tc>
@@ -2158,7 +2481,21 @@
               <w:rPr>
                 <w:color w:val="11437E"/>
               </w:rPr>
-              <w:t xml:space="preserve"> {{leadername}}</w:t>
+              <w:t xml:space="preserve"> {{</w:t>
+            </w:r>
+            <w:proofErr w:type="spellStart"/>
+            <w:r>
+              <w:rPr>
+                <w:color w:val="11437E"/>
+              </w:rPr>
+              <w:t>leadername</w:t>
+            </w:r>
+            <w:proofErr w:type="spellEnd"/>
+            <w:r>
+              <w:rPr>
+                <w:color w:val="11437E"/>
+              </w:rPr>
+              <w:t>}}</w:t>
             </w:r>
           </w:p>
           <w:p>
@@ -2180,7 +2517,21 @@
               <w:rPr>
                 <w:color w:val="11437E"/>
               </w:rPr>
-              <w:t>{{leaderposition}}</w:t>
+              <w:t>{{</w:t>
+            </w:r>
+            <w:proofErr w:type="spellStart"/>
+            <w:r>
+              <w:rPr>
+                <w:color w:val="11437E"/>
+              </w:rPr>
+              <w:t>leaderposition</w:t>
+            </w:r>
+            <w:proofErr w:type="spellEnd"/>
+            <w:r>
+              <w:rPr>
+                <w:color w:val="11437E"/>
+              </w:rPr>
+              <w:t>}}</w:t>
             </w:r>
           </w:p>
         </w:tc>
@@ -2849,6 +3200,7 @@
             </w:rPr>
             <w:t>{{</w:t>
           </w:r>
+          <w:proofErr w:type="spellStart"/>
           <w:r>
             <w:rPr>
               <w:b/>
@@ -2857,6 +3209,7 @@
             </w:rPr>
             <w:t>missiontitle</w:t>
           </w:r>
+          <w:proofErr w:type="spellEnd"/>
           <w:r>
             <w:rPr>
               <w:b/>
@@ -2900,7 +3253,29 @@
               <w:sz w:val="18"/>
               <w:szCs w:val="18"/>
             </w:rPr>
-            <w:t>{{client}}</w:t>
+            <w:t>{{</w:t>
+          </w:r>
+          <w:proofErr w:type="spellStart"/>
+          <w:r>
+            <w:rPr>
+              <w:b/>
+              <w:bCs/>
+              <w:color w:val="11437E"/>
+              <w:sz w:val="18"/>
+              <w:szCs w:val="18"/>
+            </w:rPr>
+            <w:t>client</w:t>
+          </w:r>
+          <w:proofErr w:type="spellEnd"/>
+          <w:r>
+            <w:rPr>
+              <w:b/>
+              <w:bCs/>
+              <w:color w:val="11437E"/>
+              <w:sz w:val="18"/>
+              <w:szCs w:val="18"/>
+            </w:rPr>
+            <w:t>}}</w:t>
           </w:r>
         </w:p>
       </w:tc>
@@ -2928,7 +3303,29 @@
               <w:sz w:val="18"/>
               <w:szCs w:val="18"/>
             </w:rPr>
-            <w:t>{{proposal}}</w:t>
+            <w:t>{{</w:t>
+          </w:r>
+          <w:proofErr w:type="spellStart"/>
+          <w:r>
+            <w:rPr>
+              <w:b/>
+              <w:bCs/>
+              <w:color w:val="11437E"/>
+              <w:sz w:val="18"/>
+              <w:szCs w:val="18"/>
+            </w:rPr>
+            <w:t>proposal</w:t>
+          </w:r>
+          <w:proofErr w:type="spellEnd"/>
+          <w:r>
+            <w:rPr>
+              <w:b/>
+              <w:bCs/>
+              <w:color w:val="11437E"/>
+              <w:sz w:val="18"/>
+              <w:szCs w:val="18"/>
+            </w:rPr>
+            <w:t>}}</w:t>
           </w:r>
         </w:p>
       </w:tc>
@@ -2974,7 +3371,18 @@
               <w:sz w:val="18"/>
               <w:szCs w:val="18"/>
             </w:rPr>
-            <w:t>{{r</w:t>
+            <w:t>{{</w:t>
+          </w:r>
+          <w:proofErr w:type="spellStart"/>
+          <w:r>
+            <w:rPr>
+              <w:b/>
+              <w:bCs/>
+              <w:color w:val="11437E"/>
+              <w:sz w:val="18"/>
+              <w:szCs w:val="18"/>
+            </w:rPr>
+            <w:t>r</w:t>
           </w:r>
           <w:r>
             <w:rPr>
@@ -2986,6 +3394,7 @@
             </w:rPr>
             <w:t>tp</w:t>
           </w:r>
+          <w:proofErr w:type="spellEnd"/>
           <w:r>
             <w:rPr>
               <w:b/>
@@ -3028,7 +3437,29 @@
               <w:sz w:val="18"/>
               <w:szCs w:val="18"/>
             </w:rPr>
-            <w:t xml:space="preserve"> {{cnpj}}</w:t>
+            <w:t xml:space="preserve"> {{</w:t>
+          </w:r>
+          <w:proofErr w:type="spellStart"/>
+          <w:r>
+            <w:rPr>
+              <w:b/>
+              <w:bCs/>
+              <w:color w:val="11437E"/>
+              <w:sz w:val="18"/>
+              <w:szCs w:val="18"/>
+            </w:rPr>
+            <w:t>cnpj</w:t>
+          </w:r>
+          <w:proofErr w:type="spellEnd"/>
+          <w:r>
+            <w:rPr>
+              <w:b/>
+              <w:bCs/>
+              <w:color w:val="11437E"/>
+              <w:sz w:val="18"/>
+              <w:szCs w:val="18"/>
+            </w:rPr>
+            <w:t>}}</w:t>
           </w:r>
         </w:p>
       </w:tc>

</xml_diff>